<commit_message>
feat: deliver requirement analysis with API and subscription tool execution
</commit_message>
<xml_diff>
--- a/packages/testkit/fixtures/documents/requirements.docx
+++ b/packages/testkit/fixtures/documents/requirements.docx
@@ -51,4 +51,15 @@
     </w:tbl>
   </w:body>
 </w:document>
+</file>
+
+<file path=word/styles.xml><?xml version="1.0" encoding="utf-8"?>
+<w:styles xmlns:w="http://schemas.openxmlformats.org/wordprocessingml/2006/main">
+  <w:style w:type="paragraph" w:styleId="Heading1">
+    <w:name w:val="heading 1"/>
+    <w:pPr>
+      <w:outlineLvl w:val="0"/>
+    </w:pPr>
+  </w:style>
+</w:styles>
 </file>
</xml_diff>